<commit_message>
Reflect named literacy strategies in Week 1 & 2 planners
Added explicit "Literacy Strategy: [name]" labels to the Literacy
Strategies row for the specific lessons already tagged in the
dashboard: Week 1 Lesson 3 (3 Reads Approach), Week 2 Lesson 1
(Frayer Model), Week 2 Lesson 4 (Accountable Talk). Existing content
in those cells preserved, just prefixed.
</commit_message>
<xml_diff>
--- a/planners/Week 1 Planner.docx
+++ b/planners/Week 1 Planner.docx
@@ -571,6 +571,17 @@
           </w:p>
         </w:tc>
         <w:tc>
+          <w:p>
+            <w:r>
+              <w:rPr>
+                <w:rFonts w:ascii="Times New Roman" w:hAnsi="Times New Roman" w:cs="Times New Roman"/>
+                <w:b/>
+                <w:color w:val="6D28D9"/>
+                <w:sz w:val="16"/>
+              </w:rPr>
+              <w:t>Literacy Strategy: 3 Reads Approach (analyzing the sample website)</w:t>
+            </w:r>
+          </w:p>
           <w:tcPr>
             <w:tcW w:w="3424" w:type="dxa"/>
             <w:tcBorders>

</xml_diff>